<commit_message>
checkpoint: pre-refactor state for fulfillment improvements
</commit_message>
<xml_diff>
--- a/scenario/260405-0050-demand-pipeline-edge-cases/Jessa_CS_Reporting_Plan.docx
+++ b/scenario/260405-0050-demand-pipeline-edge-cases/Jessa_CS_Reporting_Plan.docx
@@ -335,7 +335,19 @@
         <w:pStyle w:val="Heading1"/>
       </w:pPr>
       <w:r>
-        <w:t>Current State (Last 14 Days)</w:t>
+        <w:t>Current State (Last 14 Days — ~5,400 orders shipped)</w:t>
+      </w:r>
+    </w:p>
+    <w:p>
+      <w:r/>
+      <w:r>
+        <w:rPr>
+          <w:b/>
+        </w:rPr>
+        <w:t>Order volume:</w:t>
+      </w:r>
+      <w:r>
+        <w:t xml:space="preserve"> ~2,700 orders/week (Sat ~2,300 + Tue ~400) from Shopify + Recharge</w:t>
       </w:r>
     </w:p>
     <w:tbl>
@@ -345,13 +357,14 @@
         <w:tblLook w:firstColumn="1" w:firstRow="1" w:lastColumn="0" w:lastRow="0" w:noHBand="0" w:noVBand="1" w:val="04A0"/>
       </w:tblPr>
       <w:tblGrid>
-        <w:gridCol w:w="4320"/>
-        <w:gridCol w:w="4320"/>
+        <w:gridCol w:w="2880"/>
+        <w:gridCol w:w="2880"/>
+        <w:gridCol w:w="2880"/>
       </w:tblGrid>
       <w:tr>
         <w:tc>
           <w:tcPr>
-            <w:tcW w:type="dxa" w:w="4320"/>
+            <w:tcW w:type="dxa" w:w="2880"/>
           </w:tcPr>
           <w:p>
             <w:r>
@@ -361,11 +374,21 @@
         </w:tc>
         <w:tc>
           <w:tcPr>
-            <w:tcW w:type="dxa" w:w="4320"/>
+            <w:tcW w:type="dxa" w:w="2880"/>
           </w:tcPr>
           <w:p>
             <w:r>
-              <w:t>Number</w:t>
+              <w:t>Count</w:t>
+            </w:r>
+          </w:p>
+        </w:tc>
+        <w:tc>
+          <w:tcPr>
+            <w:tcW w:type="dxa" w:w="2880"/>
+          </w:tcPr>
+          <w:p>
+            <w:r>
+              <w:t>Rate (per 5,400 orders)</w:t>
             </w:r>
           </w:p>
         </w:tc>
@@ -373,17 +396,17 @@
       <w:tr>
         <w:tc>
           <w:tcPr>
-            <w:tcW w:type="dxa" w:w="4320"/>
+            <w:tcW w:type="dxa" w:w="2880"/>
           </w:tcPr>
           <w:p>
             <w:r>
-              <w:t>Operational issues found</w:t>
+              <w:t>Operational issues</w:t>
             </w:r>
           </w:p>
         </w:tc>
         <w:tc>
           <w:tcPr>
-            <w:tcW w:type="dxa" w:w="4320"/>
+            <w:tcW w:type="dxa" w:w="2880"/>
           </w:tcPr>
           <w:p>
             <w:r>
@@ -391,21 +414,31 @@
             </w:r>
           </w:p>
         </w:tc>
+        <w:tc>
+          <w:tcPr>
+            <w:tcW w:type="dxa" w:w="2880"/>
+          </w:tcPr>
+          <w:p>
+            <w:r>
+              <w:t>0.85%</w:t>
+            </w:r>
+          </w:p>
+        </w:tc>
       </w:tr>
       <w:tr>
         <w:tc>
           <w:tcPr>
-            <w:tcW w:type="dxa" w:w="4320"/>
+            <w:tcW w:type="dxa" w:w="2880"/>
           </w:tcPr>
           <w:p>
             <w:r>
-              <w:t>Food safety issues found</w:t>
+              <w:t>Food safety issues</w:t>
             </w:r>
           </w:p>
         </w:tc>
         <w:tc>
           <w:tcPr>
-            <w:tcW w:type="dxa" w:w="4320"/>
+            <w:tcW w:type="dxa" w:w="2880"/>
           </w:tcPr>
           <w:p>
             <w:r>
@@ -413,11 +446,21 @@
             </w:r>
           </w:p>
         </w:tc>
+        <w:tc>
+          <w:tcPr>
+            <w:tcW w:type="dxa" w:w="2880"/>
+          </w:tcPr>
+          <w:p>
+            <w:r>
+              <w:t>0.46%</w:t>
+            </w:r>
+          </w:p>
+        </w:tc>
       </w:tr>
       <w:tr>
         <w:tc>
           <w:tcPr>
-            <w:tcW w:type="dxa" w:w="4320"/>
+            <w:tcW w:type="dxa" w:w="2880"/>
           </w:tcPr>
           <w:p>
             <w:r>
@@ -427,7 +470,7 @@
         </w:tc>
         <w:tc>
           <w:tcPr>
-            <w:tcW w:type="dxa" w:w="4320"/>
+            <w:tcW w:type="dxa" w:w="2880"/>
           </w:tcPr>
           <w:p>
             <w:r>
@@ -435,11 +478,21 @@
             </w:r>
           </w:p>
         </w:tc>
+        <w:tc>
+          <w:tcPr>
+            <w:tcW w:type="dxa" w:w="2880"/>
+          </w:tcPr>
+          <w:p>
+            <w:r>
+              <w:t>1.31%</w:t>
+            </w:r>
+          </w:p>
+        </w:tc>
       </w:tr>
       <w:tr>
         <w:tc>
           <w:tcPr>
-            <w:tcW w:type="dxa" w:w="4320"/>
+            <w:tcW w:type="dxa" w:w="2880"/>
           </w:tcPr>
           <w:p>
             <w:r>
@@ -449,7 +502,7 @@
         </w:tc>
         <w:tc>
           <w:tcPr>
-            <w:tcW w:type="dxa" w:w="4320"/>
+            <w:tcW w:type="dxa" w:w="2880"/>
           </w:tcPr>
           <w:p>
             <w:r>
@@ -457,11 +510,21 @@
             </w:r>
           </w:p>
         </w:tc>
+        <w:tc>
+          <w:tcPr>
+            <w:tcW w:type="dxa" w:w="2880"/>
+          </w:tcPr>
+          <w:p>
+            <w:r>
+              <w:t>—</w:t>
+            </w:r>
+          </w:p>
+        </w:tc>
       </w:tr>
       <w:tr>
         <w:tc>
           <w:tcPr>
-            <w:tcW w:type="dxa" w:w="4320"/>
+            <w:tcW w:type="dxa" w:w="2880"/>
           </w:tcPr>
           <w:p>
             <w:r>
@@ -471,7 +534,7 @@
         </w:tc>
         <w:tc>
           <w:tcPr>
-            <w:tcW w:type="dxa" w:w="4320"/>
+            <w:tcW w:type="dxa" w:w="2880"/>
           </w:tcPr>
           <w:p>
             <w:r>
@@ -479,8 +542,30 @@
             </w:r>
           </w:p>
         </w:tc>
+        <w:tc>
+          <w:tcPr>
+            <w:tcW w:type="dxa" w:w="2880"/>
+          </w:tcPr>
+          <w:p>
+            <w:r>
+              <w:t>—</w:t>
+            </w:r>
+          </w:p>
+        </w:tc>
       </w:tr>
     </w:tbl>
+    <w:p>
+      <w:r/>
+      <w:r>
+        <w:rPr>
+          <w:b/>
+        </w:rPr>
+        <w:t>Context:</w:t>
+      </w:r>
+      <w:r>
+        <w:t xml:space="preserve"> 0.46% food safety rate is solid for perishable cold chain. All metrics should be tracked as rates against order volume, not raw counts — raw counts rise with growth even if quality improves.</w:t>
+      </w:r>
+    </w:p>
     <w:p>
       <w:pPr>
         <w:pStyle w:val="Heading2"/>
@@ -496,13 +581,15 @@
         <w:tblLook w:firstColumn="1" w:firstRow="1" w:lastColumn="0" w:lastRow="0" w:noHBand="0" w:noVBand="1" w:val="04A0"/>
       </w:tblPr>
       <w:tblGrid>
-        <w:gridCol w:w="4320"/>
-        <w:gridCol w:w="4320"/>
+        <w:gridCol w:w="2160"/>
+        <w:gridCol w:w="2160"/>
+        <w:gridCol w:w="2160"/>
+        <w:gridCol w:w="2160"/>
       </w:tblGrid>
       <w:tr>
         <w:tc>
           <w:tcPr>
-            <w:tcW w:type="dxa" w:w="4320"/>
+            <w:tcW w:type="dxa" w:w="2160"/>
           </w:tcPr>
           <w:p>
             <w:r>
@@ -512,7 +599,7 @@
         </w:tc>
         <w:tc>
           <w:tcPr>
-            <w:tcW w:type="dxa" w:w="4320"/>
+            <w:tcW w:type="dxa" w:w="2160"/>
           </w:tcPr>
           <w:p>
             <w:r>
@@ -520,11 +607,31 @@
             </w:r>
           </w:p>
         </w:tc>
+        <w:tc>
+          <w:tcPr>
+            <w:tcW w:type="dxa" w:w="2160"/>
+          </w:tcPr>
+          <w:p>
+            <w:r>
+              <w:t>Rate</w:t>
+            </w:r>
+          </w:p>
+        </w:tc>
+        <w:tc>
+          <w:tcPr>
+            <w:tcW w:type="dxa" w:w="2160"/>
+          </w:tcPr>
+          <w:p>
+            <w:r>
+              <w:t>Trend</w:t>
+            </w:r>
+          </w:p>
+        </w:tc>
       </w:tr>
       <w:tr>
         <w:tc>
           <w:tcPr>
-            <w:tcW w:type="dxa" w:w="4320"/>
+            <w:tcW w:type="dxa" w:w="2160"/>
           </w:tcPr>
           <w:p>
             <w:r>
@@ -534,7 +641,7 @@
         </w:tc>
         <w:tc>
           <w:tcPr>
-            <w:tcW w:type="dxa" w:w="4320"/>
+            <w:tcW w:type="dxa" w:w="2160"/>
           </w:tcPr>
           <w:p>
             <w:r>
@@ -542,11 +649,31 @@
             </w:r>
           </w:p>
         </w:tc>
+        <w:tc>
+          <w:tcPr>
+            <w:tcW w:type="dxa" w:w="2160"/>
+          </w:tcPr>
+          <w:p>
+            <w:r>
+              <w:t>0.22%</w:t>
+            </w:r>
+          </w:p>
+        </w:tc>
+        <w:tc>
+          <w:tcPr>
+            <w:tcW w:type="dxa" w:w="2160"/>
+          </w:tcPr>
+          <w:p>
+            <w:r>
+              <w:t>Trending up (summer)</w:t>
+            </w:r>
+          </w:p>
+        </w:tc>
       </w:tr>
       <w:tr>
         <w:tc>
           <w:tcPr>
-            <w:tcW w:type="dxa" w:w="4320"/>
+            <w:tcW w:type="dxa" w:w="2160"/>
           </w:tcPr>
           <w:p>
             <w:r>
@@ -556,7 +683,7 @@
         </w:tc>
         <w:tc>
           <w:tcPr>
-            <w:tcW w:type="dxa" w:w="4320"/>
+            <w:tcW w:type="dxa" w:w="2160"/>
           </w:tcPr>
           <w:p>
             <w:r>
@@ -564,11 +691,31 @@
             </w:r>
           </w:p>
         </w:tc>
+        <w:tc>
+          <w:tcPr>
+            <w:tcW w:type="dxa" w:w="2160"/>
+          </w:tcPr>
+          <w:p>
+            <w:r>
+              <w:t>0.19%</w:t>
+            </w:r>
+          </w:p>
+        </w:tc>
+        <w:tc>
+          <w:tcPr>
+            <w:tcW w:type="dxa" w:w="2160"/>
+          </w:tcPr>
+          <w:p>
+            <w:r>
+              <w:t>Stable</w:t>
+            </w:r>
+          </w:p>
+        </w:tc>
       </w:tr>
       <w:tr>
         <w:tc>
           <w:tcPr>
-            <w:tcW w:type="dxa" w:w="4320"/>
+            <w:tcW w:type="dxa" w:w="2160"/>
           </w:tcPr>
           <w:p>
             <w:r>
@@ -578,7 +725,7 @@
         </w:tc>
         <w:tc>
           <w:tcPr>
-            <w:tcW w:type="dxa" w:w="4320"/>
+            <w:tcW w:type="dxa" w:w="2160"/>
           </w:tcPr>
           <w:p>
             <w:r>
@@ -586,11 +733,73 @@
             </w:r>
           </w:p>
         </w:tc>
+        <w:tc>
+          <w:tcPr>
+            <w:tcW w:type="dxa" w:w="2160"/>
+          </w:tcPr>
+          <w:p>
+            <w:r>
+              <w:t>0.15%</w:t>
+            </w:r>
+          </w:p>
+        </w:tc>
+        <w:tc>
+          <w:tcPr>
+            <w:tcW w:type="dxa" w:w="2160"/>
+          </w:tcPr>
+          <w:p>
+            <w:r>
+              <w:t>Stable</w:t>
+            </w:r>
+          </w:p>
+        </w:tc>
       </w:tr>
       <w:tr>
         <w:tc>
           <w:tcPr>
-            <w:tcW w:type="dxa" w:w="4320"/>
+            <w:tcW w:type="dxa" w:w="2160"/>
+          </w:tcPr>
+          <w:p>
+            <w:r>
+              <w:t>Quality Complaint (cheese)</w:t>
+            </w:r>
+          </w:p>
+        </w:tc>
+        <w:tc>
+          <w:tcPr>
+            <w:tcW w:type="dxa" w:w="2160"/>
+          </w:tcPr>
+          <w:p>
+            <w:r>
+              <w:t>~8</w:t>
+            </w:r>
+          </w:p>
+        </w:tc>
+        <w:tc>
+          <w:tcPr>
+            <w:tcW w:type="dxa" w:w="2160"/>
+          </w:tcPr>
+          <w:p>
+            <w:r>
+              <w:t>0.15%</w:t>
+            </w:r>
+          </w:p>
+        </w:tc>
+        <w:tc>
+          <w:tcPr>
+            <w:tcW w:type="dxa" w:w="2160"/>
+          </w:tcPr>
+          <w:p>
+            <w:r>
+              <w:t>Stable</w:t>
+            </w:r>
+          </w:p>
+        </w:tc>
+      </w:tr>
+      <w:tr>
+        <w:tc>
+          <w:tcPr>
+            <w:tcW w:type="dxa" w:w="2160"/>
           </w:tcPr>
           <w:p>
             <w:r>
@@ -600,7 +809,7 @@
         </w:tc>
         <w:tc>
           <w:tcPr>
-            <w:tcW w:type="dxa" w:w="4320"/>
+            <w:tcW w:type="dxa" w:w="2160"/>
           </w:tcPr>
           <w:p>
             <w:r>
@@ -608,25 +817,23 @@
             </w:r>
           </w:p>
         </w:tc>
-      </w:tr>
-      <w:tr>
         <w:tc>
           <w:tcPr>
-            <w:tcW w:type="dxa" w:w="4320"/>
+            <w:tcW w:type="dxa" w:w="2160"/>
           </w:tcPr>
           <w:p>
             <w:r>
-              <w:t>Quality Complaint (cheese)</w:t>
+              <w:t>0.07%</w:t>
             </w:r>
           </w:p>
         </w:tc>
         <w:tc>
           <w:tcPr>
-            <w:tcW w:type="dxa" w:w="4320"/>
+            <w:tcW w:type="dxa" w:w="2160"/>
           </w:tcPr>
           <w:p>
             <w:r>
-              <w:t>~8</w:t>
+              <w:t>Stable</w:t>
             </w:r>
           </w:p>
         </w:tc>
@@ -634,7 +841,7 @@
       <w:tr>
         <w:tc>
           <w:tcPr>
-            <w:tcW w:type="dxa" w:w="4320"/>
+            <w:tcW w:type="dxa" w:w="2160"/>
           </w:tcPr>
           <w:p>
             <w:r>
@@ -644,7 +851,7 @@
         </w:tc>
         <w:tc>
           <w:tcPr>
-            <w:tcW w:type="dxa" w:w="4320"/>
+            <w:tcW w:type="dxa" w:w="2160"/>
           </w:tcPr>
           <w:p>
             <w:r>
@@ -652,11 +859,31 @@
             </w:r>
           </w:p>
         </w:tc>
+        <w:tc>
+          <w:tcPr>
+            <w:tcW w:type="dxa" w:w="2160"/>
+          </w:tcPr>
+          <w:p>
+            <w:r>
+              <w:t>0.06%</w:t>
+            </w:r>
+          </w:p>
+        </w:tc>
+        <w:tc>
+          <w:tcPr>
+            <w:tcW w:type="dxa" w:w="2160"/>
+          </w:tcPr>
+          <w:p>
+            <w:r>
+              <w:t>Monitor</w:t>
+            </w:r>
+          </w:p>
+        </w:tc>
       </w:tr>
       <w:tr>
         <w:tc>
           <w:tcPr>
-            <w:tcW w:type="dxa" w:w="4320"/>
+            <w:tcW w:type="dxa" w:w="2160"/>
           </w:tcPr>
           <w:p>
             <w:r>
@@ -666,11 +893,31 @@
         </w:tc>
         <w:tc>
           <w:tcPr>
-            <w:tcW w:type="dxa" w:w="4320"/>
+            <w:tcW w:type="dxa" w:w="2160"/>
           </w:tcPr>
           <w:p>
             <w:r>
               <w:t>~2</w:t>
+            </w:r>
+          </w:p>
+        </w:tc>
+        <w:tc>
+          <w:tcPr>
+            <w:tcW w:type="dxa" w:w="2160"/>
+          </w:tcPr>
+          <w:p>
+            <w:r>
+              <w:t>0.04%</w:t>
+            </w:r>
+          </w:p>
+        </w:tc>
+        <w:tc>
+          <w:tcPr>
+            <w:tcW w:type="dxa" w:w="2160"/>
+          </w:tcPr>
+          <w:p>
+            <w:r>
+              <w:t>Low</w:t>
             </w:r>
           </w:p>
         </w:tc>
@@ -1291,25 +1538,28 @@
         <w:t xml:space="preserve">  Cancellation requests: 42</w:t>
         <w:br/>
         <w:br/>
-        <w:t>OPERATIONAL ISSUES</w:t>
+        <w:t>ORDER VOLUME: 2,700 orders shipped this week</w:t>
         <w:br/>
-        <w:t xml:space="preserve">  Arrived Warm: 12 (↑ — entering summer)</w:t>
         <w:br/>
-        <w:t xml:space="preserve">  Missing Item: 10 (stable)</w:t>
+        <w:t>OPERATIONAL ISSUES (46 issues = 0.85% of orders)</w:t>
         <w:br/>
-        <w:t xml:space="preserve">  Substitute Complaint: 8 (stable)</w:t>
+        <w:t xml:space="preserve">  Arrived Warm: 12 / 2,700 = 0.44% (↑ — entering summer)</w:t>
         <w:br/>
-        <w:t xml:space="preserve">  Wrong Order: 4 (↓)</w:t>
+        <w:t xml:space="preserve">  Missing Item: 10 / 2,700 = 0.37% (stable)</w:t>
+        <w:br/>
+        <w:t xml:space="preserve">  Substitute Complaint: 8 / 2,700 = 0.30% (stable)</w:t>
+        <w:br/>
+        <w:t xml:space="preserve">  Wrong Order: 4 / 2,700 = 0.15% (↓)</w:t>
         <w:br/>
         <w:t xml:space="preserve">  </w:t>
         <w:br/>
-        <w:t>FOOD SAFETY</w:t>
+        <w:t>FOOD SAFETY (25 issues = 0.46% of orders — target: &lt;1%)</w:t>
         <w:br/>
-        <w:t xml:space="preserve">  Quality Complaints: 8</w:t>
+        <w:t xml:space="preserve">  Quality Complaints: 8 (0.15%)</w:t>
         <w:br/>
-        <w:t xml:space="preserve">  Mold Reports: 3 (all sealed package — investigate RMFG storage)</w:t>
+        <w:t xml:space="preserve">  Mold Reports: 3 (0.06% — monitor RMFG storage)</w:t>
         <w:br/>
-        <w:t xml:space="preserve">  Off Smell: 2</w:t>
+        <w:t xml:space="preserve">  Off Smell: 2 (0.04%)</w:t>
         <w:br/>
         <w:br/>
         <w:t>RESOLUTION COST</w:t>
@@ -1322,7 +1572,7 @@
         <w:br/>
         <w:t xml:space="preserve">  Credits: 6 × $15 avg = $90</w:t>
         <w:br/>
-        <w:t xml:space="preserve">  TOTAL CS COST: $976 this week (↓12% vs last week)</w:t>
+        <w:t xml:space="preserve">  TOTAL CS COST: $976 / 2,700 orders = $0.36/order (↓12% vs last week)</w:t>
         <w:br/>
         <w:br/>
         <w:t>TOP ACTION ITEMS</w:t>

</xml_diff>